<commit_message>
corrigi erros do word
</commit_message>
<xml_diff>
--- a/BaseDados/2025115671_franciscoMartins/baseDados_franciscoMartins_2025115671.docx
+++ b/BaseDados/2025115671_franciscoMartins/baseDados_franciscoMartins_2025115671.docx
@@ -4552,7 +4552,19 @@
           <w:lang w:val="en-US"/>
         </w:rPr>
         <w:tab/>
-        <w:t>custumers            pets</w:t>
+        <w:t>cust</w:t>
+      </w:r>
+      <w:r>
+        <w:rPr>
+          <w:lang w:val="en-US"/>
+        </w:rPr>
+        <w:t>o</w:t>
+      </w:r>
+      <w:r>
+        <w:rPr>
+          <w:lang w:val="en-US"/>
+        </w:rPr>
+        <w:t>mers            pets</w:t>
       </w:r>
     </w:p>
     <w:p>
@@ -4839,7 +4851,19 @@
           <w:lang w:val="en-US"/>
         </w:rPr>
         <w:tab/>
-        <w:t xml:space="preserve">      pets                  custumers</w:t>
+        <w:t xml:space="preserve">      pets                  cust</w:t>
+      </w:r>
+      <w:r>
+        <w:rPr>
+          <w:lang w:val="en-US"/>
+        </w:rPr>
+        <w:t>o</w:t>
+      </w:r>
+      <w:r>
+        <w:rPr>
+          <w:lang w:val="en-US"/>
+        </w:rPr>
+        <w:t>mers</w:t>
       </w:r>
     </w:p>
     <w:p>
@@ -5454,7 +5478,13 @@
           </w:tcPr>
           <w:p>
             <w:r>
-              <w:t>varchar(255)</w:t>
+              <w:t>varchar(25</w:t>
+            </w:r>
+            <w:r>
+              <w:t>6</w:t>
+            </w:r>
+            <w:r>
+              <w:t>)</w:t>
             </w:r>
           </w:p>
         </w:tc>
@@ -5513,7 +5543,7 @@
           </w:tcPr>
           <w:p>
             <w:r>
-              <w:t>enum</w:t>
+              <w:t>varchar(255)</w:t>
             </w:r>
           </w:p>
         </w:tc>
@@ -5627,7 +5657,11 @@
           <w:tcPr>
             <w:tcW w:w="1557" w:type="dxa"/>
           </w:tcPr>
-          <w:p/>
+          <w:p>
+            <w:r>
+              <w:t>enum</w:t>
+            </w:r>
+          </w:p>
         </w:tc>
         <w:tc>
           <w:tcPr>
@@ -6544,11 +6578,7 @@
           <w:tcPr>
             <w:tcW w:w="1722" w:type="dxa"/>
           </w:tcPr>
-          <w:p>
-            <w:r>
-              <w:t>Chave estrangeira</w:t>
-            </w:r>
-          </w:p>
+          <w:p/>
         </w:tc>
       </w:tr>
       <w:tr>
@@ -7635,7 +7665,17 @@
       </w:tr>
     </w:tbl>
     <w:p>
-      <w:r>
+      <w:pPr>
+        <w:rPr>
+          <w:b/>
+          <w:bCs/>
+        </w:rPr>
+      </w:pPr>
+      <w:r>
+        <w:rPr>
+          <w:b/>
+          <w:bCs/>
+        </w:rPr>
         <w:lastRenderedPageBreak/>
         <w:t>events</w:t>
       </w:r>
@@ -8303,11 +8343,18 @@
     </w:tbl>
     <w:p/>
     <w:p>
-      <w:r>
-        <w:t>a</w:t>
-      </w:r>
-      <w:r>
-        <w:t>ppointments</w:t>
+      <w:pPr>
+        <w:rPr>
+          <w:b/>
+          <w:bCs/>
+        </w:rPr>
+      </w:pPr>
+      <w:r>
+        <w:rPr>
+          <w:b/>
+          <w:bCs/>
+        </w:rPr>
+        <w:t>appointments</w:t>
       </w:r>
     </w:p>
     <w:tbl>
@@ -8763,12 +8810,19 @@
     <w:p/>
     <w:p/>
     <w:p>
-      <w:r>
+      <w:pPr>
+        <w:rPr>
+          <w:b/>
+          <w:bCs/>
+        </w:rPr>
+      </w:pPr>
+      <w:r>
+        <w:rPr>
+          <w:b/>
+          <w:bCs/>
+        </w:rPr>
         <w:lastRenderedPageBreak/>
-        <w:t>r</w:t>
-      </w:r>
-      <w:r>
-        <w:t>esults</w:t>
+        <w:t>results</w:t>
       </w:r>
     </w:p>
     <w:tbl>
@@ -9502,11 +9556,18 @@
     </w:tbl>
     <w:p/>
     <w:p>
-      <w:r>
-        <w:t>s</w:t>
-      </w:r>
-      <w:r>
-        <w:t>pecies</w:t>
+      <w:pPr>
+        <w:rPr>
+          <w:b/>
+          <w:bCs/>
+        </w:rPr>
+      </w:pPr>
+      <w:r>
+        <w:rPr>
+          <w:b/>
+          <w:bCs/>
+        </w:rPr>
+        <w:t>species</w:t>
       </w:r>
     </w:p>
     <w:tbl>
@@ -9715,11 +9776,18 @@
     </w:tbl>
     <w:p/>
     <w:p>
-      <w:r>
-        <w:t>b</w:t>
-      </w:r>
-      <w:r>
-        <w:t>reeds</w:t>
+      <w:pPr>
+        <w:rPr>
+          <w:b/>
+          <w:bCs/>
+        </w:rPr>
+      </w:pPr>
+      <w:r>
+        <w:rPr>
+          <w:b/>
+          <w:bCs/>
+        </w:rPr>
+        <w:t>breeds</w:t>
       </w:r>
     </w:p>
     <w:tbl>
@@ -9990,12 +10058,19 @@
     <w:p/>
     <w:p/>
     <w:p>
-      <w:r>
+      <w:pPr>
+        <w:rPr>
+          <w:b/>
+          <w:bCs/>
+        </w:rPr>
+      </w:pPr>
+      <w:r>
+        <w:rPr>
+          <w:b/>
+          <w:bCs/>
+        </w:rPr>
         <w:lastRenderedPageBreak/>
-        <w:t>c</w:t>
-      </w:r>
-      <w:r>
-        <w:t>ustomers</w:t>
+        <w:t>customers</w:t>
       </w:r>
     </w:p>
     <w:tbl>
@@ -10262,11 +10337,18 @@
     </w:tbl>
     <w:p/>
     <w:p>
-      <w:r>
-        <w:t>p</w:t>
-      </w:r>
-      <w:r>
-        <w:t>ets</w:t>
+      <w:pPr>
+        <w:rPr>
+          <w:b/>
+          <w:bCs/>
+        </w:rPr>
+      </w:pPr>
+      <w:r>
+        <w:rPr>
+          <w:b/>
+          <w:bCs/>
+        </w:rPr>
+        <w:t>pets</w:t>
       </w:r>
     </w:p>
     <w:tbl>
@@ -10894,12 +10976,19 @@
     <w:p/>
     <w:p/>
     <w:p>
-      <w:r>
+      <w:pPr>
+        <w:rPr>
+          <w:b/>
+          <w:bCs/>
+        </w:rPr>
+      </w:pPr>
+      <w:r>
+        <w:rPr>
+          <w:b/>
+          <w:bCs/>
+        </w:rPr>
         <w:lastRenderedPageBreak/>
-        <w:t>a</w:t>
-      </w:r>
-      <w:r>
-        <w:t>doption_processes</w:t>
+        <w:t>adoption_processes</w:t>
       </w:r>
     </w:p>
     <w:tbl>
@@ -11402,11 +11491,18 @@
     </w:tbl>
     <w:p/>
     <w:p>
-      <w:r>
-        <w:t>l</w:t>
-      </w:r>
-      <w:r>
-        <w:t>ost_animals</w:t>
+      <w:pPr>
+        <w:rPr>
+          <w:b/>
+          <w:bCs/>
+        </w:rPr>
+      </w:pPr>
+      <w:r>
+        <w:rPr>
+          <w:b/>
+          <w:bCs/>
+        </w:rPr>
+        <w:t>lost_animals</w:t>
       </w:r>
     </w:p>
     <w:tbl>
@@ -11752,7 +11848,7 @@
           </w:tcPr>
           <w:p>
             <w:r>
-              <w:t>Começou adoção</w:t>
+              <w:t>Data de perdido</w:t>
             </w:r>
           </w:p>
         </w:tc>
@@ -11810,7 +11906,7 @@
           </w:tcPr>
           <w:p>
             <w:r>
-              <w:t>Acabou a adoção</w:t>
+              <w:t>Detalhes da perda</w:t>
             </w:r>
           </w:p>
         </w:tc>
@@ -11868,7 +11964,7 @@
           </w:tcPr>
           <w:p>
             <w:r>
-              <w:t>notas</w:t>
+              <w:t>Se está resgatado</w:t>
             </w:r>
           </w:p>
         </w:tc>
@@ -13435,14 +13531,18 @@
   <w:rsids>
     <w:rsidRoot w:val="001C1F42"/>
     <w:rsid w:val="000D5BDE"/>
+    <w:rsid w:val="00145073"/>
     <w:rsid w:val="001C1F42"/>
     <w:rsid w:val="005C505F"/>
     <w:rsid w:val="006139D7"/>
+    <w:rsid w:val="008705C7"/>
     <w:rsid w:val="008C01CC"/>
     <w:rsid w:val="00CB3A63"/>
+    <w:rsid w:val="00D77EC1"/>
     <w:rsid w:val="00DD7E0F"/>
     <w:rsid w:val="00F61BF9"/>
     <w:rsid w:val="00FB22B7"/>
+    <w:rsid w:val="00FC6FF2"/>
   </w:rsids>
   <m:mathPr>
     <m:mathFont m:val="Cambria Math"/>

</xml_diff>

<commit_message>
update changes from word
</commit_message>
<xml_diff>
--- a/BaseDados/2025115671_franciscoMartins/baseDados_franciscoMartins_2025115671.docx
+++ b/BaseDados/2025115671_franciscoMartins/baseDados_franciscoMartins_2025115671.docx
@@ -1092,10 +1092,10 @@
           <w:lang w:eastAsia="pt-PT"/>
         </w:rPr>
         <w:drawing>
-          <wp:inline distT="0" distB="0" distL="0" distR="0" wp14:anchorId="2207C3F1" wp14:editId="1EF4A974">
-            <wp:extent cx="5394960" cy="4808220"/>
+          <wp:inline distT="0" distB="0" distL="0" distR="0" wp14:anchorId="1B708C7B" wp14:editId="02A30664">
+            <wp:extent cx="5392420" cy="4806315"/>
             <wp:effectExtent l="0" t="0" r="0" b="0"/>
-            <wp:docPr id="1411990409" name="Imagem 6"/>
+            <wp:docPr id="1972360581" name="Imagem 25"/>
             <wp:cNvGraphicFramePr>
               <a:graphicFrameLocks xmlns:a="http://schemas.openxmlformats.org/drawingml/2006/main" noChangeAspect="1"/>
             </wp:cNvGraphicFramePr>
@@ -1124,7 +1124,7 @@
                   <pic:spPr bwMode="auto">
                     <a:xfrm>
                       <a:off x="0" y="0"/>
-                      <a:ext cx="5394960" cy="4808220"/>
+                      <a:ext cx="5392420" cy="4806315"/>
                     </a:xfrm>
                     <a:prstGeom prst="rect">
                       <a:avLst/>
@@ -13530,6 +13530,7 @@
   </w:compat>
   <w:rsids>
     <w:rsidRoot w:val="001C1F42"/>
+    <w:rsid w:val="00015EF0"/>
     <w:rsid w:val="000D5BDE"/>
     <w:rsid w:val="00145073"/>
     <w:rsid w:val="001C1F42"/>
@@ -13541,6 +13542,7 @@
     <w:rsid w:val="00D77EC1"/>
     <w:rsid w:val="00DD7E0F"/>
     <w:rsid w:val="00F61BF9"/>
+    <w:rsid w:val="00F9114A"/>
     <w:rsid w:val="00FB22B7"/>
     <w:rsid w:val="00FC6FF2"/>
   </w:rsids>

</xml_diff>